<commit_message>
Add new email entries for CENTRAL-PDA and create temporary document file
</commit_message>
<xml_diff>
--- a/emails and passwords for all 25 districts in Sri Lanka.docx
+++ b/emails and passwords for all 25 districts in Sri Lanka.docx
@@ -10,7 +10,7 @@
       </w:tblPr>
       <w:tblGrid>
         <w:gridCol w:w="3509"/>
-        <w:gridCol w:w="3283"/>
+        <w:gridCol w:w="3297"/>
         <w:gridCol w:w="2463"/>
       </w:tblGrid>
       <w:tr>
@@ -2069,39 +2069,110 @@
                 <w:szCs w:val="24"/>
               </w:rPr>
             </w:pPr>
+            <w:r>
+              <w:rPr>
+                <w:rFonts w:ascii="Times New Roman" w:eastAsia="Times New Roman" w:hAnsi="Times New Roman" w:cs="Times New Roman"/>
+                <w:sz w:val="24"/>
+                <w:szCs w:val="24"/>
+              </w:rPr>
+              <w:t>ETD@domain.com</w:t>
+            </w:r>
+          </w:p>
+        </w:tc>
+        <w:tc>
+          <w:tcPr>
+            <w:tcW w:w="0" w:type="auto"/>
+            <w:shd w:val="clear" w:color="auto" w:fill="C6D9F1" w:themeFill="text2" w:themeFillTint="33"/>
+          </w:tcPr>
+          <w:p>
+            <w:pPr>
+              <w:rPr>
+                <w:rFonts w:ascii="Times New Roman" w:eastAsia="Times New Roman" w:hAnsi="Times New Roman" w:cs="Times New Roman"/>
+                <w:sz w:val="24"/>
+                <w:szCs w:val="24"/>
+              </w:rPr>
+            </w:pPr>
+            <w:r>
+              <w:rPr>
+                <w:rFonts w:ascii="Times New Roman" w:eastAsia="Times New Roman" w:hAnsi="Times New Roman" w:cs="Times New Roman"/>
+                <w:sz w:val="24"/>
+                <w:szCs w:val="24"/>
+              </w:rPr>
+              <w:t>ETD@2025</w:t>
+            </w:r>
+          </w:p>
+        </w:tc>
+      </w:tr>
+      <w:tr>
+        <w:tc>
+          <w:tcPr>
+            <w:tcW w:w="0" w:type="auto"/>
+            <w:shd w:val="clear" w:color="auto" w:fill="C6D9F1" w:themeFill="text2" w:themeFillTint="33"/>
+          </w:tcPr>
+          <w:p>
+            <w:pPr>
+              <w:rPr>
+                <w:rFonts w:ascii="Times New Roman" w:eastAsia="Times New Roman" w:hAnsi="Times New Roman" w:cs="Times New Roman"/>
+                <w:sz w:val="24"/>
+                <w:szCs w:val="24"/>
+              </w:rPr>
+            </w:pPr>
+            <w:r>
+              <w:rPr>
+                <w:rFonts w:ascii="Times New Roman" w:eastAsia="Times New Roman" w:hAnsi="Times New Roman" w:cs="Times New Roman"/>
+                <w:sz w:val="24"/>
+                <w:szCs w:val="24"/>
+              </w:rPr>
+              <w:t>CENTRAL-PDA</w:t>
+            </w:r>
+          </w:p>
+        </w:tc>
+        <w:tc>
+          <w:tcPr>
+            <w:tcW w:w="0" w:type="auto"/>
+            <w:shd w:val="clear" w:color="auto" w:fill="C6D9F1" w:themeFill="text2" w:themeFillTint="33"/>
+          </w:tcPr>
+          <w:p>
+            <w:pPr>
+              <w:rPr>
+                <w:rFonts w:ascii="Times New Roman" w:eastAsia="Times New Roman" w:hAnsi="Times New Roman" w:cs="Times New Roman"/>
+                <w:sz w:val="24"/>
+                <w:szCs w:val="24"/>
+              </w:rPr>
+            </w:pPr>
+            <w:r>
+              <w:rPr>
+                <w:rFonts w:ascii="Times New Roman" w:eastAsia="Times New Roman" w:hAnsi="Times New Roman" w:cs="Times New Roman"/>
+                <w:sz w:val="24"/>
+                <w:szCs w:val="24"/>
+              </w:rPr>
+              <w:t>CENTRAL-PDA@domain.com</w:t>
+            </w:r>
+          </w:p>
+        </w:tc>
+        <w:tc>
+          <w:tcPr>
+            <w:tcW w:w="0" w:type="auto"/>
+            <w:shd w:val="clear" w:color="auto" w:fill="C6D9F1" w:themeFill="text2" w:themeFillTint="33"/>
+          </w:tcPr>
+          <w:p>
+            <w:pPr>
+              <w:rPr>
+                <w:rFonts w:ascii="Times New Roman" w:eastAsia="Times New Roman" w:hAnsi="Times New Roman" w:cs="Times New Roman"/>
+                <w:sz w:val="24"/>
+                <w:szCs w:val="24"/>
+              </w:rPr>
+            </w:pPr>
+            <w:r>
+              <w:rPr>
+                <w:rFonts w:ascii="Times New Roman" w:eastAsia="Times New Roman" w:hAnsi="Times New Roman" w:cs="Times New Roman"/>
+                <w:sz w:val="24"/>
+                <w:szCs w:val="24"/>
+              </w:rPr>
+              <w:t>CENTRAL-pda@2025</w:t>
+            </w:r>
             <w:bookmarkStart w:id="0" w:name="_GoBack"/>
-            <w:r>
-              <w:rPr>
-                <w:rFonts w:ascii="Times New Roman" w:eastAsia="Times New Roman" w:hAnsi="Times New Roman" w:cs="Times New Roman"/>
-                <w:sz w:val="24"/>
-                <w:szCs w:val="24"/>
-              </w:rPr>
-              <w:t>ETD@domain.com</w:t>
-            </w:r>
             <w:bookmarkEnd w:id="0"/>
-          </w:p>
-        </w:tc>
-        <w:tc>
-          <w:tcPr>
-            <w:tcW w:w="0" w:type="auto"/>
-            <w:shd w:val="clear" w:color="auto" w:fill="C6D9F1" w:themeFill="text2" w:themeFillTint="33"/>
-          </w:tcPr>
-          <w:p>
-            <w:pPr>
-              <w:rPr>
-                <w:rFonts w:ascii="Times New Roman" w:eastAsia="Times New Roman" w:hAnsi="Times New Roman" w:cs="Times New Roman"/>
-                <w:sz w:val="24"/>
-                <w:szCs w:val="24"/>
-              </w:rPr>
-            </w:pPr>
-            <w:r>
-              <w:rPr>
-                <w:rFonts w:ascii="Times New Roman" w:eastAsia="Times New Roman" w:hAnsi="Times New Roman" w:cs="Times New Roman"/>
-                <w:sz w:val="24"/>
-                <w:szCs w:val="24"/>
-              </w:rPr>
-              <w:t>ETD@2025</w:t>
-            </w:r>
           </w:p>
         </w:tc>
       </w:tr>

</xml_diff>